<commit_message>
Limitations now lead with Eileen's own framing
Asked which limitation she would raise first if an interviewer challenged the
analysis. Her answer was the binary thumbs-up, not self-selection as the draft
had it — a better instinct, because self-selection is a sampling caveat while
this one biases the level of every number including the threshold.

Her own labels quantify it: 19 of 200 were genuinely mixed and Steam recorded 17
of those as positive, so roughly one review in ten is flattened into a category
it does not belong in. She confirmed "direction, not measurement" as how far she
trusts the daily share.

The authorship note now distinguishes that paragraph as hers and says to leave
it as written. The rest of the drafted sections remain the agent's.

Co-Authored-By: Claude Opus 5 <noreply@anthropic.com>
</commit_message>
<xml_diff>
--- a/deliverables/launch-sentiment-report.docx
+++ b/deliverables/launch-sentiment-report.docx
@@ -580,6 +580,23 @@
     </w:p>
     <w:p>
       <w:r>
+        <w:t>The thumbs-up is binary, and that is the limitation I would raise first. Steam gives</w:t>
+        <w:br/>
+        <w:t>one bit per review, so "great game, terrible servers" is recorded exactly the same as</w:t>
+        <w:br/>
+        <w:t>"perfect". When I hand-labelled 200 reviews, 19 were genuinely mixed — and</w:t>
+        <w:br/>
+        <w:t>Steam had 17 of those as positive. Roughly one in ten of the sample is flattened into a</w:t>
+        <w:br/>
+        <w:t>category it does not belong in. It is why I treat the daily positive share as a</w:t>
+        <w:br/>
+        <w:t>direction, not a measurement: the shape of the collapses is real, but I would not defend</w:t>
+        <w:br/>
+        <w:t>the exact level of any single day.</w:t>
+      </w:r>
+    </w:p>
+    <w:p>
+      <w:r>
         <w:t>Steam reviewers self-select. This measures people moved enough to write something,</w:t>
         <w:br/>
         <w:t>not players. Both events here were the kind that motivate writing — an account</w:t>
@@ -587,17 +604,6 @@
         <w:t>requirement and a balance change — so the corpus is probably closer to "engaged and</w:t>
         <w:br/>
         <w:t>annoyed" than to the playerbase.</w:t>
-      </w:r>
-    </w:p>
-    <w:p>
-      <w:r>
-        <w:t>Sentiment is a thumbs-up, not a measurement. Steam's flag is binary, so a review</w:t>
-        <w:br/>
-        <w:t>saying "great game, terrible servers" counts identically to one saying "perfect". The</w:t>
-        <w:br/>
-        <w:t>200 hand-labelled reviews included 19 that were genuinely mixed, and the flag</w:t>
-        <w:br/>
-        <w:t>cannot represent them. This understates ambivalence throughout.</w:t>
       </w:r>
     </w:p>
     <w:p>

</xml_diff>

<commit_message>
Recommendation carries Eileen's answer to the obvious objection
Asked whether the binary thumbs-up undermines the 12-point threshold. Her
answer: "a 12-point drop is still a 12-point drop." That separates a claim about
levels from a claim about change, which is the distinction the whole rule rests
on, and it is the natural consequence of the "direction, not measurement" line
she gave for Limitations.

Now in both the report and the deck. The authorship note marks this paragraph
and the Limitations opening as hers, to be left as written.

Co-Authored-By: Claude Opus 5 <noreply@anthropic.com>
</commit_message>
<xml_diff>
--- a/deliverables/launch-sentiment-report.docx
+++ b/deliverables/launch-sentiment-report.docx
@@ -859,6 +859,19 @@
     </w:p>
     <w:p>
       <w:r>
+        <w:t>Why the blunt signal does not undermine this. The thumbs-up is binary, and I said</w:t>
+        <w:br/>
+        <w:t>above that I treat the daily share as a direction rather than a measurement. That is an</w:t>
+        <w:br/>
+        <w:t>argument about levels, and this is a rule about change. A 12-point drop is still a</w:t>
+        <w:br/>
+        <w:t>12-point drop. The flag is exactly as blunt the day before as the day after, so what it</w:t>
+        <w:br/>
+        <w:t>misses does not move between them.</w:t>
+      </w:r>
+    </w:p>
+    <w:p>
+      <w:r>
         <w:t>When it trips, read the theme mix, not the reviews. That is what this pipeline is</w:t>
         <w:br/>
         <w:t>actually for. On 3 May the mix moved from 21% to 57% Sony/PSN while balance complaints</w:t>

</xml_diff>

<commit_message>
Report, deck and case study carry Eileen's verdict on the null
"A good outcome, better than forcing a fake finding" — her words, answering the
question an interviewer will ask about a null result. Now opens a short "On the
result being a null" section in the report, leads the null slide in the deck,
and sits in the case study's interpretation.

Three passages in the drafted sections are now hers and marked not to be
overwritten: the Limitations opening, the threshold defence, and this.

Co-Authored-By: Claude Opus 5 <noreply@anthropic.com>
</commit_message>
<xml_diff>
--- a/deliverables/launch-sentiment-report.docx
+++ b/deliverables/launch-sentiment-report.docx
@@ -188,6 +188,23 @@
       </w:pPr>
       <w:r>
         <w:t>review shifts a theme's share by seven points.</w:t>
+      </w:r>
+    </w:p>
+    <w:p>
+      <w:pPr>
+        <w:pStyle w:val="Heading1"/>
+      </w:pPr>
+      <w:r>
+        <w:t>On the result being a null</w:t>
+      </w:r>
+    </w:p>
+    <w:p>
+      <w:r>
+        <w:t>This is a good outcome — better than forcing a fake finding. The first correlation table</w:t>
+        <w:br/>
+        <w:t>showed a twelve-day lead and looked publishable. Three checks later there was nothing</w:t>
+        <w:br/>
+        <w:t>there. A number that does not survive being tested is worth less than no number.</w:t>
       </w:r>
     </w:p>
     <w:p>

</xml_diff>